<commit_message>
Fix page 1 typos and grammar; remove truncated abstract sentence
Co-Authored-By: Claude Sonnet 5.5 <noreply@anthropic.com>
Claude-Session: https://claude.ai/code/session_01RLFRzHS5VojHRpKtpsLvKP
</commit_message>
<xml_diff>
--- a/RMfF_Final 1.docx
+++ b/RMfF_Final 1.docx
@@ -473,7 +473,7 @@
           <w:szCs w:val="22"/>
           <w:lang w:val="en-US"/>
         </w:rPr>
-        <w:t xml:space="preserve"> We reproduce the paper’s main estimates including a market and Fama-French five factor robustness checks. We observe that the paper is no</w:t>
+        <w:t xml:space="preserve"> We reproduce the paper’s main estimates including a market and Fama-French five factor robustness checks.</w:t>
       </w:r>
     </w:p>
     <w:p>
@@ -543,7 +543,7 @@
           <w:szCs w:val="22"/>
           <w:lang w:val="en-US"/>
         </w:rPr>
-        <w:t>Eisfeldt et all find significant</w:t>
+        <w:t>Eisfeldt et al. find significant</w:t>
       </w:r>
       <w:r>
         <w:rPr>
@@ -759,7 +759,7 @@
           <w:szCs w:val="22"/>
           <w:lang w:val="en-US"/>
         </w:rPr>
-        <w:t>which are also</w:t>
+        <w:t>and are</w:t>
       </w:r>
       <w:r>
         <w:rPr>
@@ -777,7 +777,7 @@
           <w:szCs w:val="22"/>
           <w:lang w:val="en-US"/>
         </w:rPr>
-        <w:t xml:space="preserve">unreversed. </w:t>
+        <w:t xml:space="preserve">not reversed afterwards. </w:t>
       </w:r>
       <w:r>
         <w:rPr>
@@ -813,7 +813,7 @@
           <w:szCs w:val="22"/>
           <w:lang w:val="en-US"/>
         </w:rPr>
-        <w:t xml:space="preserve"> the task composure of different types of </w:t>
+        <w:t xml:space="preserve"> the task composition of different types of </w:t>
       </w:r>
       <w:r>
         <w:rPr>
@@ -920,7 +920,7 @@
           <w:szCs w:val="22"/>
           <w:lang w:val="en-US"/>
         </w:rPr>
-        <w:t xml:space="preserve">A summary of Eisfeldt et al including a reconstruction of the paper’s hypothesis from the premises and assumptions made, an insight into the construction of the firm exposure measure, a presentation of the paper’s main results; </w:t>
+        <w:t xml:space="preserve">A summary of Eisfeldt et al., including a reconstruction of the paper’s hypotheses from the premises and assumptions made, an insight into the construction of the firm exposure measure, a presentation of the paper’s main results; </w:t>
       </w:r>
       <w:r>
         <w:rPr>
@@ -1010,7 +1010,7 @@
           <w:szCs w:val="22"/>
           <w:lang w:val="en-US"/>
         </w:rPr>
-        <w:t xml:space="preserve"> the regressor tests we later conduct</w:t>
+        <w:t xml:space="preserve"> the regression tests we later conduct</w:t>
       </w:r>
       <w:r>
         <w:rPr>

</xml_diff>

<commit_message>
Fix grammar on pages 2-4; keep 1.2 heading with its text
Co-Authored-By: Claude Sonnet 5.5 <noreply@anthropic.com>
Claude-Session: https://claude.ai/code/session_01RLFRzHS5VojHRpKtpsLvKP
</commit_message>
<xml_diff>
--- a/RMfF_Final 1.docx
+++ b/RMfF_Final 1.docx
@@ -1303,7 +1303,7 @@
           <w:szCs w:val="22"/>
           <w:lang w:val="en-US"/>
         </w:rPr>
-        <w:t xml:space="preserve">2022, is a major technological breakthrough for </w:t>
+        <w:t xml:space="preserve">2022, is a major technological breakthrough for the </w:t>
       </w:r>
       <w:r>
         <w:rPr>
@@ -1375,7 +1375,7 @@
           <w:szCs w:val="22"/>
           <w:lang w:val="en-US"/>
         </w:rPr>
-        <w:t xml:space="preserve"> substitution channel allows to save costs (</w:t>
+        <w:t xml:space="preserve"> substitution channel allows firms to save costs (</w:t>
       </w:r>
       <w:r>
         <w:rPr>
@@ -1393,7 +1393,7 @@
           <w:szCs w:val="22"/>
           <w:lang w:val="en-US"/>
         </w:rPr>
-        <w:t>). These benefits remain even after including the cost of implementation and external externalities (</w:t>
+        <w:t>). These benefits remain even after including the cost of implementation and externalities (</w:t>
       </w:r>
       <w:r>
         <w:rPr>
@@ -1411,7 +1411,7 @@
           <w:szCs w:val="22"/>
           <w:lang w:val="en-US"/>
         </w:rPr>
-        <w:t>). Economic information about potential firm productivity from the common use of Generative AI is incorporated into stock prices (P3). Firms with a greater exposure to Generative AI are expected to benefit from its use, translated by an increase in their future expected cash flows (P</w:t>
+        <w:t>). Economic information about potential firm productivity from the common use of Generative AI is incorporated into stock prices (P3). Firms with a greater exposure to Generative AI are expected to benefit from its use, reflected in an increase in their future expected cash flows (P</w:t>
       </w:r>
       <w:r>
         <w:rPr>
@@ -1475,7 +1475,7 @@
           <w:szCs w:val="22"/>
           <w:lang w:val="en-US"/>
         </w:rPr>
-        <w:t>2022, firms with greater workforce exposure experience higher abnormal stock returns than those who are less exposed.</w:t>
+        <w:t>2022, firms with greater workforce exposure experience higher abnormal stock returns than those that are less exposed.</w:t>
       </w:r>
     </w:p>
     <w:p>
@@ -1496,7 +1496,7 @@
           <w:szCs w:val="22"/>
           <w:lang w:val="en-US"/>
         </w:rPr>
-        <w:t>P1: Generative Artificial intelligence is a major technological breakthrough publicly accessible, affecting the workforce market.</w:t>
+        <w:t>P1: Generative artificial intelligence is a major technological breakthrough publicly accessible, affecting the workforce market.</w:t>
       </w:r>
     </w:p>
     <w:p>
@@ -1673,7 +1673,7 @@
           <w:szCs w:val="22"/>
           <w:lang w:val="en-US"/>
         </w:rPr>
-        <w:t>A1: Investors incorporated new information into stock prices based on their belief in the firm's expected cash flows by seeing the potential of the firm’s productivity. </w:t>
+        <w:t>A1: Investors incorporate new information into stock prices based on their belief in the firm's expected cash flows by seeing the potential of the firm’s productivity. </w:t>
       </w:r>
     </w:p>
     <w:p>
@@ -1738,6 +1738,7 @@
     </w:p>
     <w:p>
       <w:pPr>
+        <w:keepNext/>
         <w:spacing w:before="320" w:after="160" w:line="360" w:lineRule="auto"/>
         <w:outlineLvl w:val="1"/>
         <w:rPr>
@@ -1788,7 +1789,7 @@
           <w:lang w:val="en-US"/>
         </w:rPr>
         <w:lastRenderedPageBreak/>
-        <w:t>describes 19,265 task statements across U.S. occupations. Using OpenAI’s GPT-3.5 Turbo model as a research assistant, the authors evaluate each task against a fixed rubric of Learning Language Model (LLM) capabilities. A task receives a score of 1.0 (direct exposure) if ChatGPT alone is able to cut the completion time by at least half while task quality remains equivalent. It gets 0.5 (indirect exposure) if ChatGPT alone was not enough, but with additional software built on top of LLMs could achieve that time saving and equivalent quality. In all other cases, it receives a score of 0 (no exposure). This step rests on four assumptions.</w:t>
+        <w:t>describes 19,265 task statements across U.S. occupations. Using OpenAI’s GPT-3.5 Turbo model as a research assistant, the authors evaluate each task against a fixed rubric of Large Language Model (LLM) capabilities. A task receives a score of 1.0 (direct exposure) if ChatGPT alone is able to cut the completion time by at least half while task quality remains equivalent. It receives a score of 0.5 (indirect exposure) if ChatGPT alone is not enough, but with additional software built on top of LLMs it can achieve that time saving and equivalent quality. In all other cases, it receives a score of 0 (no exposure). This step rests on four assumptions.</w:t>
       </w:r>
     </w:p>
     <w:p>
@@ -1810,7 +1811,7 @@
           <w:szCs w:val="22"/>
           <w:lang w:val="en-US"/>
         </w:rPr>
-        <w:t xml:space="preserve">First, a time reduction of at least 50% with the same quality is a meaningful threshold for exposure. Second, quality is equivalent when an outside reviewer cannot tell whether a human worked alone or with help of LLMs. Third, ChatGPT-3.5 Turbo is able to reliably assign tasks to a predefined rubric rather than having to predict its own future capabilities. Fourth, the 0.5 weight for indirect exposure fairly reflects the additional development effort and slower adoption involved with additional software usage. Next, the task scores are aggregated into occupations. For each 8-digit O*Net occupation, exposure is computed as the simple average score of all tasks in that occupation. These are then averaged across sub-codes to match 6-digit Standard Occupational Classification (SOC) codes. Here, the authors assume that an occupation can be treated as a portfolio of separable tasks, and that every task contributes equally toward its baseline occupational exposure score. In mechanism tests, they also separate tasks into core (central duties) and supplemental tasks (secondary duties). This split assumes that exposure in core tasks drives substitution, meaning cost savings and possible job displacement, while exposure in supplemental tasks drives complementarity, as it frees time for workers’ main duties. </w:t>
+        <w:t xml:space="preserve">First, a time reduction of at least 50% with the same quality is a meaningful threshold for exposure. Second, quality is equivalent when an outside reviewer cannot tell whether a human worked alone or with the help of LLMs. Third, GPT-3.5 Turbo is able to reliably assign tasks to a predefined rubric rather than having to predict its own future capabilities. Fourth, the 0.5 weight for indirect exposure fairly reflects the additional development effort and slower adoption involved with additional software usage. Next, the task scores are aggregated into occupations. For each 8-digit O*Net occupation, exposure is computed as the simple average score of all tasks in that occupation. These are then averaged across sub-codes to match 6-digit Standard Occupational Classification (SOC) codes. Here, the authors assume that an occupation can be treated as a portfolio of separable tasks, and that every task contributes equally toward its baseline occupational exposure score. In mechanism tests, they also separate tasks into core (central duties) and supplemental tasks (secondary duties). This split assumes that exposure in core tasks drives substitution, meaning cost savings and possible job displacement, while exposure in supplemental tasks drives complementarity, as it frees time for workers’ main duties. </w:t>
       </w:r>
       <w:r>
         <w:rPr>
@@ -1828,7 +1829,7 @@
           <w:szCs w:val="22"/>
           <w:lang w:val="en-US"/>
         </w:rPr>
-        <w:t>Finally, the occupation scores are linked to publicly traded firms. Using online resume and profile data from Revelio Labs, the authors calculate what share of each firm’s headcount belongs to each 6-digit SOC occupation. A firm’s overall workforce exposure is calculated as the weighted average of its occupations’ exposure scores, weighted by each occupation’s employment share within the firm. This step involves three assumptions. The first is that the public resume and online profile data accurately represent the real occupational employment mix of public companies. The second is that workers in the same occupation perform the same mix of tasks regardless of the firm they are employed in. The third is that exposure is linear in headcount shares, so that the number of employees in an occupation reflects how important it is to the firm’s operations. </w:t>
+        <w:t>Finally, the occupation scores are linked to publicly traded firms. Using online resume and profile data from Revelio Labs, the authors calculate what share of each firm’s headcount belongs to each 6-digit SOC occupation. A firm’s overall workforce exposure is calculated as the weighted average of its occupations’ exposure scores, weighted by each occupation’s employment share within the firm. This step involves three assumptions. The first is that the publicly available resume and online profile data accurately represent the real occupational employment mix of public companies. The second is that workers in the same occupation perform the same mix of tasks regardless of the firm they are employed in. The third is that exposure is linear in headcount shares, so that the number of employees in an occupation reflects how important it is to the firm’s operations. </w:t>
       </w:r>
     </w:p>
     <w:p>
@@ -1905,7 +1906,7 @@
           <w:szCs w:val="22"/>
           <w:lang w:val="en-US"/>
         </w:rPr>
-        <w:t xml:space="preserve">Beyond documenting the effect on firm value, the authors investigate the reasons why it changed. Specifically, they tested whether the revaluation came from expected cash flow growth through </w:t>
+        <w:t xml:space="preserve">Beyond documenting the effect on firm value, the authors investigate the reasons why it changed. Specifically, they test whether the revaluation came from expected cash flow growth through </w:t>
       </w:r>
       <w:r>
         <w:rPr>
@@ -1999,7 +2000,7 @@
           <w:szCs w:val="22"/>
           <w:lang w:val="en-US"/>
         </w:rPr>
-        <w:t xml:space="preserve"> demand and wages 1.4% lower, while those exposed through supplemental tasks, such as architects or financial managers, experienced positive effects. Since the value increase was concentrated in core-task exposure, the authors conclude that labor substitution was the main driver.</w:t>
+        <w:t xml:space="preserve"> demand and 1.4% lower wages, while those exposed through supplemental tasks, such as architects or financial managers, experienced positive effects. Since the value increase was concentrated in core-task exposure, the authors conclude that labor substitution was the main driver.</w:t>
       </w:r>
     </w:p>
     <w:p>

</xml_diff>

<commit_message>
Replace Gen. AI / GenAI abbreviations with generative AI
Co-Authored-By: Claude Sonnet 5.5 <noreply@anthropic.com>
Claude-Session: https://claude.ai/code/session_01RLFRzHS5VojHRpKtpsLvKP
</commit_message>
<xml_diff>
--- a/RMfF_Final 1.docx
+++ b/RMfF_Final 1.docx
@@ -651,7 +651,79 @@
           <w:szCs w:val="18"/>
           <w:lang w:val="en-US"/>
         </w:rPr>
-        <w:t>(Gen. AI)</w:t>
+        <w:t/>
+      </w:r>
+      <w:r>
+        <w:rPr>
+          <w:rFonts w:ascii="Century" w:hAnsi="Century" w:cs="Big Caslon Medium"/>
+          <w:sz w:val="22"/>
+          <w:szCs w:val="22"/>
+          <w:lang w:val="en-US"/>
+        </w:rPr>
+        <w:t/>
+      </w:r>
+      <w:r>
+        <w:rPr>
+          <w:rFonts w:ascii="Century" w:hAnsi="Century" w:cs="Big Caslon Medium"/>
+          <w:sz w:val="22"/>
+          <w:szCs w:val="22"/>
+          <w:lang w:val="en-US"/>
+        </w:rPr>
+        <w:t>and shorts</w:t>
+      </w:r>
+      <w:r>
+        <w:rPr>
+          <w:rFonts w:ascii="Century" w:hAnsi="Century" w:cs="Big Caslon Medium"/>
+          <w:sz w:val="22"/>
+          <w:szCs w:val="22"/>
+          <w:lang w:val="en-US"/>
+        </w:rPr>
+        <w:t xml:space="preserve"> the least exposed quintile of firms in </w:t>
+      </w:r>
+      <w:r>
+        <w:rPr>
+          <w:rFonts w:ascii="Century" w:hAnsi="Century" w:cs="Big Caslon Medium"/>
+          <w:sz w:val="22"/>
+          <w:szCs w:val="22"/>
+          <w:lang w:val="en-US"/>
+        </w:rPr>
+        <w:t>the</w:t>
+      </w:r>
+      <w:r>
+        <w:rPr>
+          <w:rFonts w:ascii="Century" w:hAnsi="Century" w:cs="Big Caslon Medium"/>
+          <w:sz w:val="22"/>
+          <w:szCs w:val="22"/>
+          <w:lang w:val="en-US"/>
+        </w:rPr>
+        <w:t xml:space="preserve"> two-week </w:t>
+      </w:r>
+      <w:r>
+        <w:rPr>
+          <w:rFonts w:ascii="Century" w:hAnsi="Century" w:cs="Big Caslon Medium"/>
+          <w:sz w:val="22"/>
+          <w:szCs w:val="22"/>
+          <w:lang w:val="en-US"/>
+        </w:rPr>
+        <w:t>period</w:t>
+      </w:r>
+      <w:r>
+        <w:rPr>
+          <w:rFonts w:ascii="Century" w:hAnsi="Century" w:cs="Big Caslon Medium"/>
+          <w:sz w:val="22"/>
+          <w:szCs w:val="22"/>
+          <w:lang w:val="en-US"/>
+        </w:rPr>
+        <w:t xml:space="preserve"> following the release of ChatGPT</w:t>
+      </w:r>
+      <w:r>
+        <w:rPr>
+          <w:rFonts w:ascii="Century" w:hAnsi="Century" w:cs="Big Caslon Medium"/>
+          <w:sz w:val="22"/>
+          <w:szCs w:val="22"/>
+          <w:lang w:val="en-US"/>
+        </w:rPr>
+        <w:t>. This</w:t>
       </w:r>
       <w:r>
         <w:rPr>
@@ -669,61 +741,25 @@
           <w:szCs w:val="22"/>
           <w:lang w:val="en-US"/>
         </w:rPr>
-        <w:t>and shorts</w:t>
-      </w:r>
-      <w:r>
-        <w:rPr>
-          <w:rFonts w:ascii="Century" w:hAnsi="Century" w:cs="Big Caslon Medium"/>
-          <w:sz w:val="22"/>
-          <w:szCs w:val="22"/>
-          <w:lang w:val="en-US"/>
-        </w:rPr>
-        <w:t xml:space="preserve"> the least exposed quintile of firms in </w:t>
-      </w:r>
-      <w:r>
-        <w:rPr>
-          <w:rFonts w:ascii="Century" w:hAnsi="Century" w:cs="Big Caslon Medium"/>
-          <w:sz w:val="22"/>
-          <w:szCs w:val="22"/>
-          <w:lang w:val="en-US"/>
-        </w:rPr>
-        <w:t>the</w:t>
-      </w:r>
-      <w:r>
-        <w:rPr>
-          <w:rFonts w:ascii="Century" w:hAnsi="Century" w:cs="Big Caslon Medium"/>
-          <w:sz w:val="22"/>
-          <w:szCs w:val="22"/>
-          <w:lang w:val="en-US"/>
-        </w:rPr>
-        <w:t xml:space="preserve"> two-week </w:t>
-      </w:r>
-      <w:r>
-        <w:rPr>
-          <w:rFonts w:ascii="Century" w:hAnsi="Century" w:cs="Big Caslon Medium"/>
-          <w:sz w:val="22"/>
-          <w:szCs w:val="22"/>
-          <w:lang w:val="en-US"/>
-        </w:rPr>
-        <w:t>period</w:t>
-      </w:r>
-      <w:r>
-        <w:rPr>
-          <w:rFonts w:ascii="Century" w:hAnsi="Century" w:cs="Big Caslon Medium"/>
-          <w:sz w:val="22"/>
-          <w:szCs w:val="22"/>
-          <w:lang w:val="en-US"/>
-        </w:rPr>
-        <w:t xml:space="preserve"> following the release of ChatGPT</w:t>
-      </w:r>
-      <w:r>
-        <w:rPr>
-          <w:rFonts w:ascii="Century" w:hAnsi="Century" w:cs="Big Caslon Medium"/>
-          <w:sz w:val="22"/>
-          <w:szCs w:val="22"/>
-          <w:lang w:val="en-US"/>
-        </w:rPr>
-        <w:t>. This</w:t>
+        <w:t>suggests</w:t>
+      </w:r>
+      <w:r>
+        <w:rPr>
+          <w:rFonts w:ascii="Century" w:hAnsi="Century" w:cs="Big Caslon Medium"/>
+          <w:sz w:val="22"/>
+          <w:szCs w:val="22"/>
+          <w:lang w:val="en-US"/>
+        </w:rPr>
+        <w:t xml:space="preserve"> that expectations of the impact of generative AI on firms’ future cash flows are incorporated into prices, </w:t>
+      </w:r>
+      <w:r>
+        <w:rPr>
+          <w:rFonts w:ascii="Century" w:hAnsi="Century" w:cs="Big Caslon Medium"/>
+          <w:sz w:val="22"/>
+          <w:szCs w:val="22"/>
+          <w:lang w:val="en-US"/>
+        </w:rPr>
+        <w:t>and are</w:t>
       </w:r>
       <w:r>
         <w:rPr>
@@ -741,25 +777,70 @@
           <w:szCs w:val="22"/>
           <w:lang w:val="en-US"/>
         </w:rPr>
-        <w:t>suggests</w:t>
-      </w:r>
-      <w:r>
-        <w:rPr>
-          <w:rFonts w:ascii="Century" w:hAnsi="Century" w:cs="Big Caslon Medium"/>
-          <w:sz w:val="22"/>
-          <w:szCs w:val="22"/>
-          <w:lang w:val="en-US"/>
-        </w:rPr>
-        <w:t xml:space="preserve"> that expectations of the impact of Gen. AI on firms’ future cash flows are incorporated into prices, </w:t>
-      </w:r>
-      <w:r>
-        <w:rPr>
-          <w:rFonts w:ascii="Century" w:hAnsi="Century" w:cs="Big Caslon Medium"/>
-          <w:sz w:val="22"/>
-          <w:szCs w:val="22"/>
-          <w:lang w:val="en-US"/>
-        </w:rPr>
-        <w:t>and are</w:t>
+        <w:t xml:space="preserve">not reversed afterwards. </w:t>
+      </w:r>
+      <w:r>
+        <w:rPr>
+          <w:rFonts w:ascii="Century" w:hAnsi="Century" w:cs="Big Caslon Medium"/>
+          <w:sz w:val="22"/>
+          <w:szCs w:val="22"/>
+          <w:lang w:val="en-US"/>
+        </w:rPr>
+        <w:t>The authors</w:t>
+      </w:r>
+      <w:r>
+        <w:rPr>
+          <w:rFonts w:ascii="Century" w:hAnsi="Century" w:cs="Big Caslon Medium"/>
+          <w:sz w:val="22"/>
+          <w:szCs w:val="22"/>
+          <w:lang w:val="en-US"/>
+        </w:rPr>
+        <w:t xml:space="preserve"> identify two distinct channels that explain the cumulative abnormal return difference – the effect on labor, both substitution and complementarity, motivating </w:t>
+      </w:r>
+      <w:r>
+        <w:rPr>
+          <w:rFonts w:ascii="Century" w:hAnsi="Century" w:cs="Big Caslon Medium"/>
+          <w:sz w:val="22"/>
+          <w:szCs w:val="22"/>
+          <w:lang w:val="en-US"/>
+        </w:rPr>
+        <w:t>a look into</w:t>
+      </w:r>
+      <w:r>
+        <w:rPr>
+          <w:rFonts w:ascii="Century" w:hAnsi="Century" w:cs="Big Caslon Medium"/>
+          <w:sz w:val="22"/>
+          <w:szCs w:val="22"/>
+          <w:lang w:val="en-US"/>
+        </w:rPr>
+        <w:t xml:space="preserve"> the task composition of different types of </w:t>
+      </w:r>
+      <w:r>
+        <w:rPr>
+          <w:rFonts w:ascii="Century" w:hAnsi="Century" w:cs="Big Caslon Medium"/>
+          <w:sz w:val="22"/>
+          <w:szCs w:val="22"/>
+          <w:lang w:val="en-US"/>
+        </w:rPr>
+        <w:t>labor</w:t>
+      </w:r>
+      <w:r>
+        <w:rPr>
+          <w:rFonts w:ascii="Century" w:hAnsi="Century" w:cs="Big Caslon Medium"/>
+          <w:sz w:val="22"/>
+          <w:szCs w:val="22"/>
+          <w:lang w:val="en-US"/>
+        </w:rPr>
+        <w:t xml:space="preserve"> and </w:t>
+      </w:r>
+      <w:r>
+        <w:rPr>
+          <w:rFonts w:ascii="Century" w:hAnsi="Century" w:cs="Big Caslon Medium"/>
+          <w:sz w:val="22"/>
+          <w:szCs w:val="22"/>
+          <w:lang w:val="en-US"/>
+        </w:rPr>
+        <w:t>each task’s</w:t>
       </w:r>
       <w:r>
         <w:rPr>
@@ -777,88 +858,7 @@
           <w:szCs w:val="22"/>
           <w:lang w:val="en-US"/>
         </w:rPr>
-        <w:t xml:space="preserve">not reversed afterwards. </w:t>
-      </w:r>
-      <w:r>
-        <w:rPr>
-          <w:rFonts w:ascii="Century" w:hAnsi="Century" w:cs="Big Caslon Medium"/>
-          <w:sz w:val="22"/>
-          <w:szCs w:val="22"/>
-          <w:lang w:val="en-US"/>
-        </w:rPr>
-        <w:t>The authors</w:t>
-      </w:r>
-      <w:r>
-        <w:rPr>
-          <w:rFonts w:ascii="Century" w:hAnsi="Century" w:cs="Big Caslon Medium"/>
-          <w:sz w:val="22"/>
-          <w:szCs w:val="22"/>
-          <w:lang w:val="en-US"/>
-        </w:rPr>
-        <w:t xml:space="preserve"> identify two distinct channels that explain the cumulative abnormal return difference – the effect on labor, both substitution and complementarity, motivating </w:t>
-      </w:r>
-      <w:r>
-        <w:rPr>
-          <w:rFonts w:ascii="Century" w:hAnsi="Century" w:cs="Big Caslon Medium"/>
-          <w:sz w:val="22"/>
-          <w:szCs w:val="22"/>
-          <w:lang w:val="en-US"/>
-        </w:rPr>
-        <w:t>a look into</w:t>
-      </w:r>
-      <w:r>
-        <w:rPr>
-          <w:rFonts w:ascii="Century" w:hAnsi="Century" w:cs="Big Caslon Medium"/>
-          <w:sz w:val="22"/>
-          <w:szCs w:val="22"/>
-          <w:lang w:val="en-US"/>
-        </w:rPr>
-        <w:t xml:space="preserve"> the task composition of different types of </w:t>
-      </w:r>
-      <w:r>
-        <w:rPr>
-          <w:rFonts w:ascii="Century" w:hAnsi="Century" w:cs="Big Caslon Medium"/>
-          <w:sz w:val="22"/>
-          <w:szCs w:val="22"/>
-          <w:lang w:val="en-US"/>
-        </w:rPr>
-        <w:t>labor</w:t>
-      </w:r>
-      <w:r>
-        <w:rPr>
-          <w:rFonts w:ascii="Century" w:hAnsi="Century" w:cs="Big Caslon Medium"/>
-          <w:sz w:val="22"/>
-          <w:szCs w:val="22"/>
-          <w:lang w:val="en-US"/>
-        </w:rPr>
-        <w:t xml:space="preserve"> and </w:t>
-      </w:r>
-      <w:r>
-        <w:rPr>
-          <w:rFonts w:ascii="Century" w:hAnsi="Century" w:cs="Big Caslon Medium"/>
-          <w:sz w:val="22"/>
-          <w:szCs w:val="22"/>
-          <w:lang w:val="en-US"/>
-        </w:rPr>
-        <w:t>each task’s</w:t>
-      </w:r>
-      <w:r>
-        <w:rPr>
-          <w:rFonts w:ascii="Century" w:hAnsi="Century" w:cs="Big Caslon Medium"/>
-          <w:sz w:val="22"/>
-          <w:szCs w:val="22"/>
-          <w:lang w:val="en-US"/>
-        </w:rPr>
-        <w:t xml:space="preserve"> </w:t>
-      </w:r>
-      <w:r>
-        <w:rPr>
-          <w:rFonts w:ascii="Century" w:hAnsi="Century" w:cs="Big Caslon Medium"/>
-          <w:sz w:val="22"/>
-          <w:szCs w:val="22"/>
-          <w:lang w:val="en-US"/>
-        </w:rPr>
-        <w:t>exposure to AI; the effect on products, namely the displacement of value from the introduction of Gen. AI.</w:t>
+        <w:t>exposure to AI; the effect on products, namely the displacement of value from the introduction of generative AI.</w:t>
       </w:r>
     </w:p>
     <w:p>
@@ -2086,7 +2086,7 @@
           <w:szCs w:val="22"/>
           <w:lang w:val="en-US"/>
         </w:rPr>
-        <w:t>Eisfeldt et. all report a 5% estimate of the difference in cumulative abnormal returns post-ChatGPT between firms in the highest and the lowest quintiles of employee task exposure to Generative AI. Some of the paper length is owed to the complex construction of core and supplemental task exposure rates. The principal channel is labor exposure: workforce productivity gains under complementarity or cost-saving labor substitution affect the expected free cash in company fundamentals. The secondary channel is product value displacement by AI, or that products become at least in part obsolete with the development of AI, which is later observed to not be statistically significant from within-industry variation. Controls for market co-movements seem robust, with CAPM and Fama-French Five Factors Model returning significant alpha after the event period. In this section, we propose that these controls are correct, the channels well-identified, and that the unreversed valuation difference is correctly attributed to the GenAI technological shock.</w:t>
+        <w:t>Eisfeldt et. all report a 5% estimate of the difference in cumulative abnormal returns post-ChatGPT between firms in the highest and the lowest quintiles of employee task exposure to Generative AI. Some of the paper length is owed to the complex construction of core and supplemental task exposure rates. The principal channel is labor exposure: workforce productivity gains under complementarity or cost-saving labor substitution affect the expected free cash in company fundamentals. The secondary channel is product value displacement by AI, or that products become at least in part obsolete with the development of AI, which is later observed to not be statistically significant from within-industry variation. Controls for market co-movements seem robust, with CAPM and Fama-French Five Factors Model returning significant alpha after the event period. In this section, we propose that these controls are correct, the channels well-identified, and that the unreversed valuation difference is correctly attributed to the generative AI technological shock.</w:t>
       </w:r>
     </w:p>
     <w:p>
@@ -6138,7 +6138,7 @@
                 <w:szCs w:val="18"/>
                 <w:lang w:val="en-US"/>
               </w:rPr>
-              <w:t>“GenAI Exposure”</w:t>
+              <w:t>“Generative AI Exposure”</w:t>
             </w:r>
           </w:p>
         </w:tc>
@@ -8161,7 +8161,7 @@
           <w:szCs w:val="22"/>
           <w:lang w:val="en-US"/>
         </w:rPr>
-        <w:t xml:space="preserve">In order to replicate the paper’s central estimate, we followed the original portfolio sorting methodology applied to data collected in Section 3 : raw excess returns, CAPM and FF5 adjusted abnormal returns. As on the paper, firms are sorted into value weighted quintiles based on their GenAI score, </w:t>
+        <w:t xml:space="preserve">In order to replicate the paper’s central estimate, we followed the original portfolio sorting methodology applied to data collected in Section 3 : raw excess returns, CAPM and FF5 adjusted abnormal returns. As on the paper, firms are sorted into value weighted quintiles based on their generative AI score, </w:t>
       </w:r>
       <w:r>
         <w:rPr>

</xml_diff>

<commit_message>
Restore (Gen. AI) definition; capitalize Generative AI
Co-Authored-By: Claude Sonnet 5.5 <noreply@anthropic.com>
Claude-Session: https://claude.ai/code/session_01RLFRzHS5VojHRpKtpsLvKP
</commit_message>
<xml_diff>
--- a/RMfF_Final 1.docx
+++ b/RMfF_Final 1.docx
@@ -651,16 +651,16 @@
           <w:szCs w:val="18"/>
           <w:lang w:val="en-US"/>
         </w:rPr>
-        <w:t/>
-      </w:r>
-      <w:r>
-        <w:rPr>
-          <w:rFonts w:ascii="Century" w:hAnsi="Century" w:cs="Big Caslon Medium"/>
-          <w:sz w:val="22"/>
-          <w:szCs w:val="22"/>
-          <w:lang w:val="en-US"/>
-        </w:rPr>
-        <w:t/>
+        <w:t>(Gen. AI)</w:t>
+      </w:r>
+      <w:r>
+        <w:rPr>
+          <w:rFonts w:ascii="Century" w:hAnsi="Century" w:cs="Big Caslon Medium"/>
+          <w:sz w:val="22"/>
+          <w:szCs w:val="22"/>
+          <w:lang w:val="en-US"/>
+        </w:rPr>
+        <w:t xml:space="preserve"> </w:t>
       </w:r>
       <w:r>
         <w:rPr>
@@ -750,7 +750,7 @@
           <w:szCs w:val="22"/>
           <w:lang w:val="en-US"/>
         </w:rPr>
-        <w:t xml:space="preserve"> that expectations of the impact of generative AI on firms’ future cash flows are incorporated into prices, </w:t>
+        <w:t xml:space="preserve"> that expectations of the impact of Generative AI on firms’ future cash flows are incorporated into prices, </w:t>
       </w:r>
       <w:r>
         <w:rPr>
@@ -858,7 +858,7 @@
           <w:szCs w:val="22"/>
           <w:lang w:val="en-US"/>
         </w:rPr>
-        <w:t>exposure to AI; the effect on products, namely the displacement of value from the introduction of generative AI.</w:t>
+        <w:t>exposure to AI; the effect on products, namely the displacement of value from the introduction of Generative AI.</w:t>
       </w:r>
     </w:p>
     <w:p>
@@ -2086,7 +2086,7 @@
           <w:szCs w:val="22"/>
           <w:lang w:val="en-US"/>
         </w:rPr>
-        <w:t>Eisfeldt et. all report a 5% estimate of the difference in cumulative abnormal returns post-ChatGPT between firms in the highest and the lowest quintiles of employee task exposure to Generative AI. Some of the paper length is owed to the complex construction of core and supplemental task exposure rates. The principal channel is labor exposure: workforce productivity gains under complementarity or cost-saving labor substitution affect the expected free cash in company fundamentals. The secondary channel is product value displacement by AI, or that products become at least in part obsolete with the development of AI, which is later observed to not be statistically significant from within-industry variation. Controls for market co-movements seem robust, with CAPM and Fama-French Five Factors Model returning significant alpha after the event period. In this section, we propose that these controls are correct, the channels well-identified, and that the unreversed valuation difference is correctly attributed to the generative AI technological shock.</w:t>
+        <w:t>Eisfeldt et. all report a 5% estimate of the difference in cumulative abnormal returns post-ChatGPT between firms in the highest and the lowest quintiles of employee task exposure to Generative AI. Some of the paper length is owed to the complex construction of core and supplemental task exposure rates. The principal channel is labor exposure: workforce productivity gains under complementarity or cost-saving labor substitution affect the expected free cash in company fundamentals. The secondary channel is product value displacement by AI, or that products become at least in part obsolete with the development of AI, which is later observed to not be statistically significant from within-industry variation. Controls for market co-movements seem robust, with CAPM and Fama-French Five Factors Model returning significant alpha after the event period. In this section, we propose that these controls are correct, the channels well-identified, and that the unreversed valuation difference is correctly attributed to the Generative AI technological shock.</w:t>
       </w:r>
     </w:p>
     <w:p>
@@ -8161,7 +8161,7 @@
           <w:szCs w:val="22"/>
           <w:lang w:val="en-US"/>
         </w:rPr>
-        <w:t xml:space="preserve">In order to replicate the paper’s central estimate, we followed the original portfolio sorting methodology applied to data collected in Section 3 : raw excess returns, CAPM and FF5 adjusted abnormal returns. As on the paper, firms are sorted into value weighted quintiles based on their generative AI score, </w:t>
+        <w:t xml:space="preserve">In order to replicate the paper’s central estimate, we followed the original portfolio sorting methodology applied to data collected in Section 3 : raw excess returns, CAPM and FF5 adjusted abnormal returns. As on the paper, firms are sorted into value weighted quintiles based on their Generative AI score, </w:t>
       </w:r>
       <w:r>
         <w:rPr>

</xml_diff>

<commit_message>
Align estimation-window statements with t = -253 to -46
Co-Authored-By: Claude Sonnet 5.5 <noreply@anthropic.com>
Claude-Session: https://claude.ai/code/session_01RLFRzHS5VojHRpKtpsLvKP
</commit_message>
<xml_diff>
--- a/RMfF_Final 1.docx
+++ b/RMfF_Final 1.docx
@@ -5125,7 +5125,7 @@
           <w:szCs w:val="22"/>
           <w:lang w:val="en-US"/>
         </w:rPr>
-        <w:t>Starting from 4,844 firms, we keep firms headquartered in the United States (4,094), as the exposure measure is built on US jobs. We then keep ordinary common shares only, which removes 1,235 exchange-traded funds, 221 closed-end funds and 2 depositary receipts: these investment vehicles carry the workforce exposure of the asset manager that sponsors them rather than that of an operating firm. We require at least 150 daily returns during the one-year estimation period so that each firm's market beta is reliably estimated (2,</w:t>
+        <w:t xml:space="preserve">Starting from 4,844 firms, we keep firms headquartered in the United States (4,094), as the exposure measure is built on US jobs. We then keep ordinary common shares only, which removes 1,235 exchange-traded funds, 221 closed-end funds and 2 depositary receipts: these investment vehicles carry the workforce exposure of the asset manager that sponsors them rather than that of an operating firm. We require at least 150 daily returns during the estimation window (t = −253 to −46) so that each firm's market beta is reliably estimated (2,</w:t>
       </w:r>
       <w:r>
         <w:rPr>
@@ -8959,7 +8959,7 @@
           <w:lang w:val="en-US"/>
         </w:rPr>
         <w:lastRenderedPageBreak/>
-        <w:t>t-statistics based on heteroskedasticity-robust (HC1) standard errors; CAR are portfolio cumulative abnormal returns as described in Section 4.1 (top vs. bottom Exposure quintile, weighted on Nov 29, 2022, market-cap weights), summed over t=0...10; Baseline AR = daily excess return minus French's Mkt-RF; CAPM and FF firm CARs use loadings estimated May 18 - Nov 14, 2022; Regressions are WLS (weights = Nov 29, 2022, market cap) and introduce Book-to-market as a control; FE is 3-digit NAICS where marked and applies to the Exposure regression only (categories with &gt;=10 firms); Significance: * p&lt;0.10, ** p&lt;0.05, *** p&lt;0.01.</w:t>
+        <w:t xml:space="preserve">t-statistics based on heteroskedasticity-robust (HC1) standard errors; CAR are portfolio cumulative abnormal returns as described in Section 4.1 (top vs. bottom Exposure quintile, weighted on Nov 29, 2022, market-cap weights), summed over t=0...10; Baseline AR = daily excess return minus French's Mkt-RF; CAPM and FF firm CARs use loadings estimated over t = −253 to −46; Regressions are WLS (weights = Nov 29, 2022, market cap) and introduce Book-to-market as a control; FE is 3-digit NAICS where marked and applies to the Exposure regression only (categories with &gt;=10 firms); Significance: * p&lt;0.10, ** p&lt;0.05, *** p&lt;0.01.</w:t>
       </w:r>
     </w:p>
     <w:p>

</xml_diff>